<commit_message>
Imagenes de la cabecera del word
</commit_message>
<xml_diff>
--- a/Memoria ERP.docx
+++ b/Memoria ERP.docx
@@ -6,6 +6,122 @@
       <w:pPr>
         <w:spacing w:after="1000"/>
       </w:pPr>
+      <w:r>
+        <w:rPr>
+          <w:noProof/>
+          <w:bdr w:val="none" w:sz="0" w:space="0" w:color="auto" w:frame="1"/>
+        </w:rPr>
+        <w:drawing>
+          <wp:anchor distT="0" distB="0" distL="114300" distR="114300" simplePos="0" relativeHeight="251658240" behindDoc="0" locked="0" layoutInCell="1" allowOverlap="1" wp14:anchorId="76212F54" wp14:editId="187FA1E5">
+            <wp:simplePos x="0" y="0"/>
+            <wp:positionH relativeFrom="column">
+              <wp:posOffset>3162300</wp:posOffset>
+            </wp:positionH>
+            <wp:positionV relativeFrom="paragraph">
+              <wp:posOffset>104775</wp:posOffset>
+            </wp:positionV>
+            <wp:extent cx="2066925" cy="476250"/>
+            <wp:effectExtent l="0" t="0" r="9525" b="0"/>
+            <wp:wrapNone/>
+            <wp:docPr id="583386361" name="Imagen 2"/>
+            <wp:cNvGraphicFramePr>
+              <a:graphicFrameLocks xmlns:a="http://schemas.openxmlformats.org/drawingml/2006/main" noChangeAspect="1"/>
+            </wp:cNvGraphicFramePr>
+            <a:graphic xmlns:a="http://schemas.openxmlformats.org/drawingml/2006/main">
+              <a:graphicData uri="http://schemas.openxmlformats.org/drawingml/2006/picture">
+                <pic:pic xmlns:pic="http://schemas.openxmlformats.org/drawingml/2006/picture">
+                  <pic:nvPicPr>
+                    <pic:cNvPr id="0" name="Picture 3"/>
+                    <pic:cNvPicPr>
+                      <a:picLocks noChangeAspect="1" noChangeArrowheads="1"/>
+                    </pic:cNvPicPr>
+                  </pic:nvPicPr>
+                  <pic:blipFill>
+                    <a:blip r:embed="rId7" cstate="print">
+                      <a:extLst>
+                        <a:ext uri="{28A0092B-C50C-407E-A947-70E740481C1C}">
+                          <a14:useLocalDpi xmlns:a14="http://schemas.microsoft.com/office/drawing/2010/main" val="0"/>
+                        </a:ext>
+                      </a:extLst>
+                    </a:blip>
+                    <a:srcRect/>
+                    <a:stretch>
+                      <a:fillRect/>
+                    </a:stretch>
+                  </pic:blipFill>
+                  <pic:spPr bwMode="auto">
+                    <a:xfrm>
+                      <a:off x="0" y="0"/>
+                      <a:ext cx="2066925" cy="476250"/>
+                    </a:xfrm>
+                    <a:prstGeom prst="rect">
+                      <a:avLst/>
+                    </a:prstGeom>
+                    <a:noFill/>
+                    <a:ln>
+                      <a:noFill/>
+                    </a:ln>
+                  </pic:spPr>
+                </pic:pic>
+              </a:graphicData>
+            </a:graphic>
+          </wp:anchor>
+        </w:drawing>
+      </w:r>
+      <w:r>
+        <w:rPr>
+          <w:noProof/>
+          <w:bdr w:val="none" w:sz="0" w:space="0" w:color="auto" w:frame="1"/>
+        </w:rPr>
+        <w:drawing>
+          <wp:inline distT="0" distB="0" distL="0" distR="0" wp14:anchorId="02F7413A" wp14:editId="4A29EC55">
+            <wp:extent cx="2400300" cy="714375"/>
+            <wp:effectExtent l="0" t="0" r="0" b="9525"/>
+            <wp:docPr id="1496175046" name="Imagen 1"/>
+            <wp:cNvGraphicFramePr>
+              <a:graphicFrameLocks xmlns:a="http://schemas.openxmlformats.org/drawingml/2006/main" noChangeAspect="1"/>
+            </wp:cNvGraphicFramePr>
+            <a:graphic xmlns:a="http://schemas.openxmlformats.org/drawingml/2006/main">
+              <a:graphicData uri="http://schemas.openxmlformats.org/drawingml/2006/picture">
+                <pic:pic xmlns:pic="http://schemas.openxmlformats.org/drawingml/2006/picture">
+                  <pic:nvPicPr>
+                    <pic:cNvPr id="0" name="Picture 1"/>
+                    <pic:cNvPicPr>
+                      <a:picLocks noChangeAspect="1" noChangeArrowheads="1"/>
+                    </pic:cNvPicPr>
+                  </pic:nvPicPr>
+                  <pic:blipFill>
+                    <a:blip r:embed="rId8">
+                      <a:extLst>
+                        <a:ext uri="{28A0092B-C50C-407E-A947-70E740481C1C}">
+                          <a14:useLocalDpi xmlns:a14="http://schemas.microsoft.com/office/drawing/2010/main" val="0"/>
+                        </a:ext>
+                      </a:extLst>
+                    </a:blip>
+                    <a:srcRect/>
+                    <a:stretch>
+                      <a:fillRect/>
+                    </a:stretch>
+                  </pic:blipFill>
+                  <pic:spPr bwMode="auto">
+                    <a:xfrm>
+                      <a:off x="0" y="0"/>
+                      <a:ext cx="2400300" cy="714375"/>
+                    </a:xfrm>
+                    <a:prstGeom prst="rect">
+                      <a:avLst/>
+                    </a:prstGeom>
+                    <a:noFill/>
+                    <a:ln>
+                      <a:noFill/>
+                    </a:ln>
+                  </pic:spPr>
+                </pic:pic>
+              </a:graphicData>
+            </a:graphic>
+          </wp:inline>
+        </w:drawing>
+      </w:r>
     </w:p>
     <w:p>
       <w:pPr>
@@ -1590,12 +1706,6 @@
         <w:gridCol w:w="1800"/>
       </w:tblGrid>
       <w:tr>
-        <w:tblPrEx>
-          <w:tblCellMar>
-            <w:top w:w="0" w:type="dxa"/>
-            <w:bottom w:w="0" w:type="dxa"/>
-          </w:tblCellMar>
-        </w:tblPrEx>
         <w:trPr>
           <w:tblHeader/>
         </w:trPr>
@@ -1703,12 +1813,6 @@
         </w:tc>
       </w:tr>
       <w:tr>
-        <w:tblPrEx>
-          <w:tblCellMar>
-            <w:top w:w="0" w:type="dxa"/>
-            <w:bottom w:w="0" w:type="dxa"/>
-          </w:tblCellMar>
-        </w:tblPrEx>
         <w:tc>
           <w:tcPr>
             <w:tcW w:w="2500" w:type="dxa"/>
@@ -1795,12 +1899,6 @@
         </w:tc>
       </w:tr>
       <w:tr>
-        <w:tblPrEx>
-          <w:tblCellMar>
-            <w:top w:w="0" w:type="dxa"/>
-            <w:bottom w:w="0" w:type="dxa"/>
-          </w:tblCellMar>
-        </w:tblPrEx>
         <w:tc>
           <w:tcPr>
             <w:tcW w:w="2500" w:type="dxa"/>
@@ -1887,12 +1985,6 @@
         </w:tc>
       </w:tr>
       <w:tr>
-        <w:tblPrEx>
-          <w:tblCellMar>
-            <w:top w:w="0" w:type="dxa"/>
-            <w:bottom w:w="0" w:type="dxa"/>
-          </w:tblCellMar>
-        </w:tblPrEx>
         <w:tc>
           <w:tcPr>
             <w:tcW w:w="2500" w:type="dxa"/>
@@ -1979,12 +2071,6 @@
         </w:tc>
       </w:tr>
       <w:tr>
-        <w:tblPrEx>
-          <w:tblCellMar>
-            <w:top w:w="0" w:type="dxa"/>
-            <w:bottom w:w="0" w:type="dxa"/>
-          </w:tblCellMar>
-        </w:tblPrEx>
         <w:tc>
           <w:tcPr>
             <w:tcW w:w="2500" w:type="dxa"/>
@@ -2071,12 +2157,6 @@
         </w:tc>
       </w:tr>
       <w:tr>
-        <w:tblPrEx>
-          <w:tblCellMar>
-            <w:top w:w="0" w:type="dxa"/>
-            <w:bottom w:w="0" w:type="dxa"/>
-          </w:tblCellMar>
-        </w:tblPrEx>
         <w:tc>
           <w:tcPr>
             <w:tcW w:w="2500" w:type="dxa"/>
@@ -2163,12 +2243,6 @@
         </w:tc>
       </w:tr>
       <w:tr>
-        <w:tblPrEx>
-          <w:tblCellMar>
-            <w:top w:w="0" w:type="dxa"/>
-            <w:bottom w:w="0" w:type="dxa"/>
-          </w:tblCellMar>
-        </w:tblPrEx>
         <w:tc>
           <w:tcPr>
             <w:tcW w:w="2500" w:type="dxa"/>
@@ -2255,12 +2329,6 @@
         </w:tc>
       </w:tr>
       <w:tr>
-        <w:tblPrEx>
-          <w:tblCellMar>
-            <w:top w:w="0" w:type="dxa"/>
-            <w:bottom w:w="0" w:type="dxa"/>
-          </w:tblCellMar>
-        </w:tblPrEx>
         <w:tc>
           <w:tcPr>
             <w:tcW w:w="2500" w:type="dxa"/>
@@ -2365,12 +2433,6 @@
         </w:tc>
       </w:tr>
       <w:tr>
-        <w:tblPrEx>
-          <w:tblCellMar>
-            <w:top w:w="0" w:type="dxa"/>
-            <w:bottom w:w="0" w:type="dxa"/>
-          </w:tblCellMar>
-        </w:tblPrEx>
         <w:tc>
           <w:tcPr>
             <w:tcW w:w="2500" w:type="dxa"/>
@@ -2459,12 +2521,6 @@
         </w:tc>
       </w:tr>
       <w:tr>
-        <w:tblPrEx>
-          <w:tblCellMar>
-            <w:top w:w="0" w:type="dxa"/>
-            <w:bottom w:w="0" w:type="dxa"/>
-          </w:tblCellMar>
-        </w:tblPrEx>
         <w:tc>
           <w:tcPr>
             <w:tcW w:w="2500" w:type="dxa"/>
@@ -2561,12 +2617,6 @@
         </w:tc>
       </w:tr>
       <w:tr>
-        <w:tblPrEx>
-          <w:tblCellMar>
-            <w:top w:w="0" w:type="dxa"/>
-            <w:bottom w:w="0" w:type="dxa"/>
-          </w:tblCellMar>
-        </w:tblPrEx>
         <w:tc>
           <w:tcPr>
             <w:tcW w:w="2500" w:type="dxa"/>
@@ -3106,12 +3156,6 @@
         <w:gridCol w:w="4500"/>
       </w:tblGrid>
       <w:tr>
-        <w:tblPrEx>
-          <w:tblCellMar>
-            <w:top w:w="0" w:type="dxa"/>
-            <w:bottom w:w="0" w:type="dxa"/>
-          </w:tblCellMar>
-        </w:tblPrEx>
         <w:trPr>
           <w:tblHeader/>
         </w:trPr>
@@ -3219,12 +3263,6 @@
         </w:tc>
       </w:tr>
       <w:tr>
-        <w:tblPrEx>
-          <w:tblCellMar>
-            <w:top w:w="0" w:type="dxa"/>
-            <w:bottom w:w="0" w:type="dxa"/>
-          </w:tblCellMar>
-        </w:tblPrEx>
         <w:tc>
           <w:tcPr>
             <w:tcW w:w="2100" w:type="dxa"/>
@@ -3329,12 +3367,6 @@
         </w:tc>
       </w:tr>
       <w:tr>
-        <w:tblPrEx>
-          <w:tblCellMar>
-            <w:top w:w="0" w:type="dxa"/>
-            <w:bottom w:w="0" w:type="dxa"/>
-          </w:tblCellMar>
-        </w:tblPrEx>
         <w:tc>
           <w:tcPr>
             <w:tcW w:w="2100" w:type="dxa"/>
@@ -3439,12 +3471,6 @@
         </w:tc>
       </w:tr>
       <w:tr>
-        <w:tblPrEx>
-          <w:tblCellMar>
-            <w:top w:w="0" w:type="dxa"/>
-            <w:bottom w:w="0" w:type="dxa"/>
-          </w:tblCellMar>
-        </w:tblPrEx>
         <w:tc>
           <w:tcPr>
             <w:tcW w:w="2100" w:type="dxa"/>
@@ -3533,12 +3559,6 @@
         </w:tc>
       </w:tr>
       <w:tr>
-        <w:tblPrEx>
-          <w:tblCellMar>
-            <w:top w:w="0" w:type="dxa"/>
-            <w:bottom w:w="0" w:type="dxa"/>
-          </w:tblCellMar>
-        </w:tblPrEx>
         <w:tc>
           <w:tcPr>
             <w:tcW w:w="2100" w:type="dxa"/>
@@ -3625,12 +3645,6 @@
         </w:tc>
       </w:tr>
       <w:tr>
-        <w:tblPrEx>
-          <w:tblCellMar>
-            <w:top w:w="0" w:type="dxa"/>
-            <w:bottom w:w="0" w:type="dxa"/>
-          </w:tblCellMar>
-        </w:tblPrEx>
         <w:tc>
           <w:tcPr>
             <w:tcW w:w="2100" w:type="dxa"/>
@@ -3755,12 +3769,6 @@
         </w:tc>
       </w:tr>
       <w:tr>
-        <w:tblPrEx>
-          <w:tblCellMar>
-            <w:top w:w="0" w:type="dxa"/>
-            <w:bottom w:w="0" w:type="dxa"/>
-          </w:tblCellMar>
-        </w:tblPrEx>
         <w:tc>
           <w:tcPr>
             <w:tcW w:w="2100" w:type="dxa"/>
@@ -3847,12 +3855,6 @@
         </w:tc>
       </w:tr>
       <w:tr>
-        <w:tblPrEx>
-          <w:tblCellMar>
-            <w:top w:w="0" w:type="dxa"/>
-            <w:bottom w:w="0" w:type="dxa"/>
-          </w:tblCellMar>
-        </w:tblPrEx>
         <w:tc>
           <w:tcPr>
             <w:tcW w:w="2100" w:type="dxa"/>
@@ -3939,12 +3941,6 @@
         </w:tc>
       </w:tr>
       <w:tr>
-        <w:tblPrEx>
-          <w:tblCellMar>
-            <w:top w:w="0" w:type="dxa"/>
-            <w:bottom w:w="0" w:type="dxa"/>
-          </w:tblCellMar>
-        </w:tblPrEx>
         <w:tc>
           <w:tcPr>
             <w:tcW w:w="2100" w:type="dxa"/>
@@ -4041,12 +4037,6 @@
         </w:tc>
       </w:tr>
       <w:tr>
-        <w:tblPrEx>
-          <w:tblCellMar>
-            <w:top w:w="0" w:type="dxa"/>
-            <w:bottom w:w="0" w:type="dxa"/>
-          </w:tblCellMar>
-        </w:tblPrEx>
         <w:tc>
           <w:tcPr>
             <w:tcW w:w="2100" w:type="dxa"/>
@@ -4133,12 +4123,6 @@
         </w:tc>
       </w:tr>
       <w:tr>
-        <w:tblPrEx>
-          <w:tblCellMar>
-            <w:top w:w="0" w:type="dxa"/>
-            <w:bottom w:w="0" w:type="dxa"/>
-          </w:tblCellMar>
-        </w:tblPrEx>
         <w:tc>
           <w:tcPr>
             <w:tcW w:w="2100" w:type="dxa"/>
@@ -4225,12 +4209,6 @@
         </w:tc>
       </w:tr>
       <w:tr>
-        <w:tblPrEx>
-          <w:tblCellMar>
-            <w:top w:w="0" w:type="dxa"/>
-            <w:bottom w:w="0" w:type="dxa"/>
-          </w:tblCellMar>
-        </w:tblPrEx>
         <w:tc>
           <w:tcPr>
             <w:tcW w:w="2100" w:type="dxa"/>
@@ -4317,12 +4295,6 @@
         </w:tc>
       </w:tr>
       <w:tr>
-        <w:tblPrEx>
-          <w:tblCellMar>
-            <w:top w:w="0" w:type="dxa"/>
-            <w:bottom w:w="0" w:type="dxa"/>
-          </w:tblCellMar>
-        </w:tblPrEx>
         <w:tc>
           <w:tcPr>
             <w:tcW w:w="2100" w:type="dxa"/>
@@ -4429,12 +4401,6 @@
         </w:tc>
       </w:tr>
       <w:tr>
-        <w:tblPrEx>
-          <w:tblCellMar>
-            <w:top w:w="0" w:type="dxa"/>
-            <w:bottom w:w="0" w:type="dxa"/>
-          </w:tblCellMar>
-        </w:tblPrEx>
         <w:tc>
           <w:tcPr>
             <w:tcW w:w="2100" w:type="dxa"/>
@@ -4539,12 +4505,6 @@
         </w:tc>
       </w:tr>
       <w:tr>
-        <w:tblPrEx>
-          <w:tblCellMar>
-            <w:top w:w="0" w:type="dxa"/>
-            <w:bottom w:w="0" w:type="dxa"/>
-          </w:tblCellMar>
-        </w:tblPrEx>
         <w:tc>
           <w:tcPr>
             <w:tcW w:w="2100" w:type="dxa"/>
@@ -5055,12 +5015,6 @@
         <w:gridCol w:w="4200"/>
       </w:tblGrid>
       <w:tr>
-        <w:tblPrEx>
-          <w:tblCellMar>
-            <w:top w:w="0" w:type="dxa"/>
-            <w:bottom w:w="0" w:type="dxa"/>
-          </w:tblCellMar>
-        </w:tblPrEx>
         <w:trPr>
           <w:tblHeader/>
         </w:trPr>
@@ -5168,12 +5122,6 @@
         </w:tc>
       </w:tr>
       <w:tr>
-        <w:tblPrEx>
-          <w:tblCellMar>
-            <w:top w:w="0" w:type="dxa"/>
-            <w:bottom w:w="0" w:type="dxa"/>
-          </w:tblCellMar>
-        </w:tblPrEx>
         <w:tc>
           <w:tcPr>
             <w:tcW w:w="1800" w:type="dxa"/>
@@ -5260,12 +5208,6 @@
         </w:tc>
       </w:tr>
       <w:tr>
-        <w:tblPrEx>
-          <w:tblCellMar>
-            <w:top w:w="0" w:type="dxa"/>
-            <w:bottom w:w="0" w:type="dxa"/>
-          </w:tblCellMar>
-        </w:tblPrEx>
         <w:tc>
           <w:tcPr>
             <w:tcW w:w="1800" w:type="dxa"/>
@@ -5370,12 +5312,6 @@
         </w:tc>
       </w:tr>
       <w:tr>
-        <w:tblPrEx>
-          <w:tblCellMar>
-            <w:top w:w="0" w:type="dxa"/>
-            <w:bottom w:w="0" w:type="dxa"/>
-          </w:tblCellMar>
-        </w:tblPrEx>
         <w:tc>
           <w:tcPr>
             <w:tcW w:w="1800" w:type="dxa"/>
@@ -5472,12 +5408,6 @@
         </w:tc>
       </w:tr>
       <w:tr>
-        <w:tblPrEx>
-          <w:tblCellMar>
-            <w:top w:w="0" w:type="dxa"/>
-            <w:bottom w:w="0" w:type="dxa"/>
-          </w:tblCellMar>
-        </w:tblPrEx>
         <w:tc>
           <w:tcPr>
             <w:tcW w:w="1800" w:type="dxa"/>
@@ -5610,12 +5540,6 @@
         </w:tc>
       </w:tr>
       <w:tr>
-        <w:tblPrEx>
-          <w:tblCellMar>
-            <w:top w:w="0" w:type="dxa"/>
-            <w:bottom w:w="0" w:type="dxa"/>
-          </w:tblCellMar>
-        </w:tblPrEx>
         <w:tc>
           <w:tcPr>
             <w:tcW w:w="1800" w:type="dxa"/>
@@ -5704,12 +5628,6 @@
         </w:tc>
       </w:tr>
       <w:tr>
-        <w:tblPrEx>
-          <w:tblCellMar>
-            <w:top w:w="0" w:type="dxa"/>
-            <w:bottom w:w="0" w:type="dxa"/>
-          </w:tblCellMar>
-        </w:tblPrEx>
         <w:tc>
           <w:tcPr>
             <w:tcW w:w="1800" w:type="dxa"/>
@@ -5807,12 +5725,6 @@
         </w:tc>
       </w:tr>
       <w:tr>
-        <w:tblPrEx>
-          <w:tblCellMar>
-            <w:top w:w="0" w:type="dxa"/>
-            <w:bottom w:w="0" w:type="dxa"/>
-          </w:tblCellMar>
-        </w:tblPrEx>
         <w:tc>
           <w:tcPr>
             <w:tcW w:w="1800" w:type="dxa"/>
@@ -5927,12 +5839,6 @@
         </w:tc>
       </w:tr>
       <w:tr>
-        <w:tblPrEx>
-          <w:tblCellMar>
-            <w:top w:w="0" w:type="dxa"/>
-            <w:bottom w:w="0" w:type="dxa"/>
-          </w:tblCellMar>
-        </w:tblPrEx>
         <w:tc>
           <w:tcPr>
             <w:tcW w:w="1800" w:type="dxa"/>
@@ -6021,12 +5927,6 @@
         </w:tc>
       </w:tr>
       <w:tr>
-        <w:tblPrEx>
-          <w:tblCellMar>
-            <w:top w:w="0" w:type="dxa"/>
-            <w:bottom w:w="0" w:type="dxa"/>
-          </w:tblCellMar>
-        </w:tblPrEx>
         <w:tc>
           <w:tcPr>
             <w:tcW w:w="1800" w:type="dxa"/>
@@ -6133,12 +6033,6 @@
         </w:tc>
       </w:tr>
       <w:tr>
-        <w:tblPrEx>
-          <w:tblCellMar>
-            <w:top w:w="0" w:type="dxa"/>
-            <w:bottom w:w="0" w:type="dxa"/>
-          </w:tblCellMar>
-        </w:tblPrEx>
         <w:tc>
           <w:tcPr>
             <w:tcW w:w="1800" w:type="dxa"/>
@@ -6624,12 +6518,6 @@
         <w:gridCol w:w="3241"/>
       </w:tblGrid>
       <w:tr>
-        <w:tblPrEx>
-          <w:tblCellMar>
-            <w:top w:w="0" w:type="dxa"/>
-            <w:bottom w:w="0" w:type="dxa"/>
-          </w:tblCellMar>
-        </w:tblPrEx>
         <w:trPr>
           <w:tblHeader/>
         </w:trPr>
@@ -6737,12 +6625,6 @@
         </w:tc>
       </w:tr>
       <w:tr>
-        <w:tblPrEx>
-          <w:tblCellMar>
-            <w:top w:w="0" w:type="dxa"/>
-            <w:bottom w:w="0" w:type="dxa"/>
-          </w:tblCellMar>
-        </w:tblPrEx>
         <w:tc>
           <w:tcPr>
             <w:tcW w:w="1700" w:type="dxa"/>
@@ -6905,12 +6787,6 @@
         </w:tc>
       </w:tr>
       <w:tr>
-        <w:tblPrEx>
-          <w:tblCellMar>
-            <w:top w:w="0" w:type="dxa"/>
-            <w:bottom w:w="0" w:type="dxa"/>
-          </w:tblCellMar>
-        </w:tblPrEx>
         <w:tc>
           <w:tcPr>
             <w:tcW w:w="1700" w:type="dxa"/>
@@ -7025,12 +6901,6 @@
         </w:tc>
       </w:tr>
       <w:tr>
-        <w:tblPrEx>
-          <w:tblCellMar>
-            <w:top w:w="0" w:type="dxa"/>
-            <w:bottom w:w="0" w:type="dxa"/>
-          </w:tblCellMar>
-        </w:tblPrEx>
         <w:tc>
           <w:tcPr>
             <w:tcW w:w="1700" w:type="dxa"/>
@@ -7237,12 +7107,6 @@
         </w:tc>
       </w:tr>
       <w:tr>
-        <w:tblPrEx>
-          <w:tblCellMar>
-            <w:top w:w="0" w:type="dxa"/>
-            <w:bottom w:w="0" w:type="dxa"/>
-          </w:tblCellMar>
-        </w:tblPrEx>
         <w:tc>
           <w:tcPr>
             <w:tcW w:w="1700" w:type="dxa"/>
@@ -7431,12 +7295,6 @@
         </w:tc>
       </w:tr>
       <w:tr>
-        <w:tblPrEx>
-          <w:tblCellMar>
-            <w:top w:w="0" w:type="dxa"/>
-            <w:bottom w:w="0" w:type="dxa"/>
-          </w:tblCellMar>
-        </w:tblPrEx>
         <w:tc>
           <w:tcPr>
             <w:tcW w:w="1700" w:type="dxa"/>
@@ -7535,12 +7393,6 @@
         </w:tc>
       </w:tr>
       <w:tr>
-        <w:tblPrEx>
-          <w:tblCellMar>
-            <w:top w:w="0" w:type="dxa"/>
-            <w:bottom w:w="0" w:type="dxa"/>
-          </w:tblCellMar>
-        </w:tblPrEx>
         <w:tc>
           <w:tcPr>
             <w:tcW w:w="1700" w:type="dxa"/>
@@ -7675,12 +7527,6 @@
         </w:tc>
       </w:tr>
       <w:tr>
-        <w:tblPrEx>
-          <w:tblCellMar>
-            <w:top w:w="0" w:type="dxa"/>
-            <w:bottom w:w="0" w:type="dxa"/>
-          </w:tblCellMar>
-        </w:tblPrEx>
         <w:tc>
           <w:tcPr>
             <w:tcW w:w="1700" w:type="dxa"/>
@@ -7833,12 +7679,6 @@
         </w:tc>
       </w:tr>
       <w:tr>
-        <w:tblPrEx>
-          <w:tblCellMar>
-            <w:top w:w="0" w:type="dxa"/>
-            <w:bottom w:w="0" w:type="dxa"/>
-          </w:tblCellMar>
-        </w:tblPrEx>
         <w:tc>
           <w:tcPr>
             <w:tcW w:w="1700" w:type="dxa"/>
@@ -8009,12 +7849,6 @@
         </w:tc>
       </w:tr>
       <w:tr>
-        <w:tblPrEx>
-          <w:tblCellMar>
-            <w:top w:w="0" w:type="dxa"/>
-            <w:bottom w:w="0" w:type="dxa"/>
-          </w:tblCellMar>
-        </w:tblPrEx>
         <w:tc>
           <w:tcPr>
             <w:tcW w:w="1700" w:type="dxa"/>
@@ -8149,12 +7983,6 @@
         </w:tc>
       </w:tr>
       <w:tr>
-        <w:tblPrEx>
-          <w:tblCellMar>
-            <w:top w:w="0" w:type="dxa"/>
-            <w:bottom w:w="0" w:type="dxa"/>
-          </w:tblCellMar>
-        </w:tblPrEx>
         <w:tc>
           <w:tcPr>
             <w:tcW w:w="1700" w:type="dxa"/>
@@ -8269,12 +8097,6 @@
         </w:tc>
       </w:tr>
       <w:tr>
-        <w:tblPrEx>
-          <w:tblCellMar>
-            <w:top w:w="0" w:type="dxa"/>
-            <w:bottom w:w="0" w:type="dxa"/>
-          </w:tblCellMar>
-        </w:tblPrEx>
         <w:tc>
           <w:tcPr>
             <w:tcW w:w="1700" w:type="dxa"/>
@@ -8427,12 +8249,6 @@
         </w:tc>
       </w:tr>
       <w:tr>
-        <w:tblPrEx>
-          <w:tblCellMar>
-            <w:top w:w="0" w:type="dxa"/>
-            <w:bottom w:w="0" w:type="dxa"/>
-          </w:tblCellMar>
-        </w:tblPrEx>
         <w:tc>
           <w:tcPr>
             <w:tcW w:w="1700" w:type="dxa"/>
@@ -9614,8 +9430,8 @@
       </w:pPr>
     </w:p>
     <w:sectPr>
-      <w:headerReference w:type="default" r:id="rId7"/>
-      <w:footerReference w:type="default" r:id="rId8"/>
+      <w:headerReference w:type="default" r:id="rId9"/>
+      <w:footerReference w:type="default" r:id="rId10"/>
       <w:pgSz w:w="11906" w:h="16838"/>
       <w:pgMar w:top="1440" w:right="1440" w:bottom="1440" w:left="1800" w:header="708" w:footer="708" w:gutter="0"/>
       <w:cols w:space="720"/>

</xml_diff>